<commit_message>
updated with final version
</commit_message>
<xml_diff>
--- a/Git_recipe_27022026.docx
+++ b/Git_recipe_27022026.docx
@@ -173,6 +173,9 @@
         </mc:AlternateContent>
       </w:r>
       <w:r>
+        <w:rPr>
+          <w:noProof/>
+        </w:rPr>
         <w:drawing>
           <wp:inline distT="0" distB="0" distL="0" distR="0" wp14:anchorId="5B267EE8" wp14:editId="4B9024B4">
             <wp:extent cx="5943600" cy="3866515"/>
@@ -230,6 +233,9 @@
     <w:p/>
     <w:p>
       <w:r>
+        <w:rPr>
+          <w:noProof/>
+        </w:rPr>
         <w:lastRenderedPageBreak/>
         <w:drawing>
           <wp:inline distT="0" distB="0" distL="0" distR="0" wp14:anchorId="0873F4CC" wp14:editId="7226218E">
@@ -290,6 +296,9 @@
     <w:p/>
     <w:p>
       <w:r>
+        <w:rPr>
+          <w:noProof/>
+        </w:rPr>
         <w:drawing>
           <wp:inline distT="0" distB="0" distL="0" distR="0" wp14:anchorId="02A2B8EE" wp14:editId="20E51C51">
             <wp:extent cx="5943600" cy="1597660"/>
@@ -343,6 +352,7 @@
         <w:rPr>
           <w:b/>
           <w:bCs/>
+          <w:noProof/>
         </w:rPr>
         <w:drawing>
           <wp:inline distT="0" distB="0" distL="0" distR="0" wp14:anchorId="2E546A88" wp14:editId="15821CA7">
@@ -412,6 +422,9 @@
     </w:p>
     <w:p>
       <w:r>
+        <w:rPr>
+          <w:noProof/>
+        </w:rPr>
         <w:drawing>
           <wp:inline distT="0" distB="0" distL="0" distR="0" wp14:anchorId="3BF1C344" wp14:editId="268DCC42">
             <wp:extent cx="5943600" cy="4998085"/>
@@ -462,14 +475,26 @@
           <w:b/>
           <w:bCs/>
         </w:rPr>
-        <w:t>Git init</w:t>
-      </w:r>
+        <w:t xml:space="preserve">Git </w:t>
+      </w:r>
+      <w:proofErr w:type="spellStart"/>
+      <w:r>
+        <w:rPr>
+          <w:b/>
+          <w:bCs/>
+        </w:rPr>
+        <w:t>init</w:t>
+      </w:r>
+      <w:proofErr w:type="spellEnd"/>
       <w:r>
         <w:t>:</w:t>
       </w:r>
     </w:p>
     <w:p>
       <w:r>
+        <w:rPr>
+          <w:noProof/>
+        </w:rPr>
         <w:drawing>
           <wp:inline distT="0" distB="0" distL="0" distR="0" wp14:anchorId="5A51AFAB" wp14:editId="51697228">
             <wp:extent cx="5943600" cy="1083310"/>
@@ -533,14 +558,26 @@
           <w:b/>
           <w:bCs/>
         </w:rPr>
-        <w:t>-lart</w:t>
-      </w:r>
+        <w:t>-</w:t>
+      </w:r>
+      <w:proofErr w:type="spellStart"/>
+      <w:r>
+        <w:rPr>
+          <w:b/>
+          <w:bCs/>
+        </w:rPr>
+        <w:t>lart</w:t>
+      </w:r>
+      <w:proofErr w:type="spellEnd"/>
       <w:r>
         <w:t>:</w:t>
       </w:r>
     </w:p>
     <w:p>
       <w:r>
+        <w:rPr>
+          <w:noProof/>
+        </w:rPr>
         <w:drawing>
           <wp:inline distT="0" distB="0" distL="0" distR="0" wp14:anchorId="10B1B663" wp14:editId="32E28E7C">
             <wp:extent cx="5943600" cy="1319530"/>
@@ -578,24 +615,13 @@
         </w:drawing>
       </w:r>
     </w:p>
-    <w:p/>
-    <w:p>
-      <w:r>
-        <w:lastRenderedPageBreak/>
-        <w:t># Shifted to Visual studio code, If Git bash is not available as a terminal</w:t>
-      </w:r>
-      <w:r>
-        <w:br/>
-      </w:r>
-      <w:r>
-        <w:br/>
-      </w:r>
+    <w:p>
       <w:r>
         <w:drawing>
-          <wp:inline distT="0" distB="0" distL="0" distR="0" wp14:anchorId="21EF81F2" wp14:editId="715D01AA">
-            <wp:extent cx="5943600" cy="5132705"/>
-            <wp:effectExtent l="0" t="0" r="0" b="0"/>
-            <wp:docPr id="14576695" name="Picture 1"/>
+          <wp:inline distT="0" distB="0" distL="0" distR="0" wp14:anchorId="6EC55C17" wp14:editId="36A937E8">
+            <wp:extent cx="5943600" cy="1482090"/>
+            <wp:effectExtent l="0" t="0" r="0" b="3810"/>
+            <wp:docPr id="1086891309" name="Picture 1"/>
             <wp:cNvGraphicFramePr>
               <a:graphicFrameLocks xmlns:a="http://schemas.openxmlformats.org/drawingml/2006/main" noChangeAspect="1"/>
             </wp:cNvGraphicFramePr>
@@ -603,7 +629,7 @@
               <a:graphicData uri="http://schemas.openxmlformats.org/drawingml/2006/picture">
                 <pic:pic xmlns:pic="http://schemas.openxmlformats.org/drawingml/2006/picture">
                   <pic:nvPicPr>
-                    <pic:cNvPr id="14576695" name=""/>
+                    <pic:cNvPr id="1086891309" name=""/>
                     <pic:cNvPicPr/>
                   </pic:nvPicPr>
                   <pic:blipFill>
@@ -615,7 +641,7 @@
                   <pic:spPr>
                     <a:xfrm>
                       <a:off x="0" y="0"/>
-                      <a:ext cx="5943600" cy="5132705"/>
+                      <a:ext cx="5943600" cy="1482090"/>
                     </a:xfrm>
                     <a:prstGeom prst="rect">
                       <a:avLst/>
@@ -628,6 +654,496 @@
         </w:drawing>
       </w:r>
     </w:p>
+    <w:p/>
+    <w:p>
+      <w:proofErr w:type="gramStart"/>
+      <w:r>
+        <w:t># git status</w:t>
+      </w:r>
+      <w:proofErr w:type="gramEnd"/>
+      <w:r>
+        <w:t>:</w:t>
+      </w:r>
+    </w:p>
+    <w:p>
+      <w:r>
+        <w:drawing>
+          <wp:inline distT="0" distB="0" distL="0" distR="0" wp14:anchorId="05A73E02" wp14:editId="7C027D22">
+            <wp:extent cx="5277587" cy="2210108"/>
+            <wp:effectExtent l="0" t="0" r="0" b="0"/>
+            <wp:docPr id="522201479" name="Picture 1"/>
+            <wp:cNvGraphicFramePr>
+              <a:graphicFrameLocks xmlns:a="http://schemas.openxmlformats.org/drawingml/2006/main" noChangeAspect="1"/>
+            </wp:cNvGraphicFramePr>
+            <a:graphic xmlns:a="http://schemas.openxmlformats.org/drawingml/2006/main">
+              <a:graphicData uri="http://schemas.openxmlformats.org/drawingml/2006/picture">
+                <pic:pic xmlns:pic="http://schemas.openxmlformats.org/drawingml/2006/picture">
+                  <pic:nvPicPr>
+                    <pic:cNvPr id="522201479" name=""/>
+                    <pic:cNvPicPr/>
+                  </pic:nvPicPr>
+                  <pic:blipFill>
+                    <a:blip r:embed="rId13"/>
+                    <a:stretch>
+                      <a:fillRect/>
+                    </a:stretch>
+                  </pic:blipFill>
+                  <pic:spPr>
+                    <a:xfrm>
+                      <a:off x="0" y="0"/>
+                      <a:ext cx="5277587" cy="2210108"/>
+                    </a:xfrm>
+                    <a:prstGeom prst="rect">
+                      <a:avLst/>
+                    </a:prstGeom>
+                  </pic:spPr>
+                </pic:pic>
+              </a:graphicData>
+            </a:graphic>
+          </wp:inline>
+        </w:drawing>
+      </w:r>
+    </w:p>
+    <w:p>
+      <w:r>
+        <w:lastRenderedPageBreak/>
+        <w:t xml:space="preserve"># git </w:t>
+      </w:r>
+      <w:proofErr w:type="gramStart"/>
+      <w:r>
+        <w:t>add .</w:t>
+      </w:r>
+      <w:proofErr w:type="gramEnd"/>
+    </w:p>
+    <w:p>
+      <w:r>
+        <w:drawing>
+          <wp:inline distT="0" distB="0" distL="0" distR="0" wp14:anchorId="02871BC7" wp14:editId="1441499B">
+            <wp:extent cx="1743318" cy="247685"/>
+            <wp:effectExtent l="0" t="0" r="0" b="0"/>
+            <wp:docPr id="460090889" name="Picture 1"/>
+            <wp:cNvGraphicFramePr>
+              <a:graphicFrameLocks xmlns:a="http://schemas.openxmlformats.org/drawingml/2006/main" noChangeAspect="1"/>
+            </wp:cNvGraphicFramePr>
+            <a:graphic xmlns:a="http://schemas.openxmlformats.org/drawingml/2006/main">
+              <a:graphicData uri="http://schemas.openxmlformats.org/drawingml/2006/picture">
+                <pic:pic xmlns:pic="http://schemas.openxmlformats.org/drawingml/2006/picture">
+                  <pic:nvPicPr>
+                    <pic:cNvPr id="460090889" name=""/>
+                    <pic:cNvPicPr/>
+                  </pic:nvPicPr>
+                  <pic:blipFill>
+                    <a:blip r:embed="rId14"/>
+                    <a:stretch>
+                      <a:fillRect/>
+                    </a:stretch>
+                  </pic:blipFill>
+                  <pic:spPr>
+                    <a:xfrm>
+                      <a:off x="0" y="0"/>
+                      <a:ext cx="1743318" cy="247685"/>
+                    </a:xfrm>
+                    <a:prstGeom prst="rect">
+                      <a:avLst/>
+                    </a:prstGeom>
+                  </pic:spPr>
+                </pic:pic>
+              </a:graphicData>
+            </a:graphic>
+          </wp:inline>
+        </w:drawing>
+      </w:r>
+    </w:p>
+    <w:p/>
+    <w:p>
+      <w:r>
+        <w:t xml:space="preserve"># git commit: </w:t>
+      </w:r>
+    </w:p>
+    <w:p>
+      <w:r>
+        <w:drawing>
+          <wp:inline distT="0" distB="0" distL="0" distR="0" wp14:anchorId="1D96D533" wp14:editId="3E7DBE66">
+            <wp:extent cx="5877745" cy="1143160"/>
+            <wp:effectExtent l="0" t="0" r="0" b="0"/>
+            <wp:docPr id="109121264" name="Picture 1"/>
+            <wp:cNvGraphicFramePr>
+              <a:graphicFrameLocks xmlns:a="http://schemas.openxmlformats.org/drawingml/2006/main" noChangeAspect="1"/>
+            </wp:cNvGraphicFramePr>
+            <a:graphic xmlns:a="http://schemas.openxmlformats.org/drawingml/2006/main">
+              <a:graphicData uri="http://schemas.openxmlformats.org/drawingml/2006/picture">
+                <pic:pic xmlns:pic="http://schemas.openxmlformats.org/drawingml/2006/picture">
+                  <pic:nvPicPr>
+                    <pic:cNvPr id="109121264" name=""/>
+                    <pic:cNvPicPr/>
+                  </pic:nvPicPr>
+                  <pic:blipFill>
+                    <a:blip r:embed="rId15"/>
+                    <a:stretch>
+                      <a:fillRect/>
+                    </a:stretch>
+                  </pic:blipFill>
+                  <pic:spPr>
+                    <a:xfrm>
+                      <a:off x="0" y="0"/>
+                      <a:ext cx="5877745" cy="1143160"/>
+                    </a:xfrm>
+                    <a:prstGeom prst="rect">
+                      <a:avLst/>
+                    </a:prstGeom>
+                  </pic:spPr>
+                </pic:pic>
+              </a:graphicData>
+            </a:graphic>
+          </wp:inline>
+        </w:drawing>
+      </w:r>
+      <w:r>
+        <w:br/>
+      </w:r>
+    </w:p>
+    <w:p>
+      <w:pPr>
+        <w:rPr>
+          <w:b/>
+          <w:bCs/>
+        </w:rPr>
+      </w:pPr>
+      <w:r>
+        <w:t>#</w:t>
+      </w:r>
+      <w:r>
+        <w:t xml:space="preserve"> </w:t>
+      </w:r>
+      <w:proofErr w:type="gramStart"/>
+      <w:r>
+        <w:rPr>
+          <w:b/>
+          <w:bCs/>
+        </w:rPr>
+        <w:t>create</w:t>
+      </w:r>
+      <w:proofErr w:type="gramEnd"/>
+      <w:r>
+        <w:rPr>
+          <w:b/>
+          <w:bCs/>
+        </w:rPr>
+        <w:t xml:space="preserve"> Repo in </w:t>
+      </w:r>
+      <w:proofErr w:type="spellStart"/>
+      <w:r>
+        <w:rPr>
+          <w:b/>
+          <w:bCs/>
+        </w:rPr>
+        <w:t>github</w:t>
+      </w:r>
+      <w:proofErr w:type="spellEnd"/>
+      <w:r>
+        <w:rPr>
+          <w:b/>
+          <w:bCs/>
+        </w:rPr>
+        <w:t>:</w:t>
+      </w:r>
+    </w:p>
+    <w:p>
+      <w:pPr>
+        <w:ind w:firstLine="720"/>
+        <w:rPr>
+          <w:b/>
+          <w:bCs/>
+        </w:rPr>
+      </w:pPr>
+      <w:r>
+        <w:rPr>
+          <w:b/>
+          <w:bCs/>
+        </w:rPr>
+        <w:t>Login to github.com</w:t>
+      </w:r>
+      <w:r>
+        <w:rPr>
+          <w:b/>
+          <w:bCs/>
+        </w:rPr>
+        <w:t xml:space="preserve"> and create new repository:</w:t>
+      </w:r>
+      <w:r>
+        <w:rPr>
+          <w:b/>
+          <w:bCs/>
+        </w:rPr>
+        <w:br/>
+      </w:r>
+      <w:r>
+        <w:rPr>
+          <w:b/>
+          <w:bCs/>
+        </w:rPr>
+        <w:drawing>
+          <wp:inline distT="0" distB="0" distL="0" distR="0" wp14:anchorId="6FE54B4C" wp14:editId="4A869061">
+            <wp:extent cx="3439005" cy="1581371"/>
+            <wp:effectExtent l="0" t="0" r="0" b="0"/>
+            <wp:docPr id="538046542" name="Picture 1"/>
+            <wp:cNvGraphicFramePr>
+              <a:graphicFrameLocks xmlns:a="http://schemas.openxmlformats.org/drawingml/2006/main" noChangeAspect="1"/>
+            </wp:cNvGraphicFramePr>
+            <a:graphic xmlns:a="http://schemas.openxmlformats.org/drawingml/2006/main">
+              <a:graphicData uri="http://schemas.openxmlformats.org/drawingml/2006/picture">
+                <pic:pic xmlns:pic="http://schemas.openxmlformats.org/drawingml/2006/picture">
+                  <pic:nvPicPr>
+                    <pic:cNvPr id="538046542" name=""/>
+                    <pic:cNvPicPr/>
+                  </pic:nvPicPr>
+                  <pic:blipFill>
+                    <a:blip r:embed="rId16"/>
+                    <a:stretch>
+                      <a:fillRect/>
+                    </a:stretch>
+                  </pic:blipFill>
+                  <pic:spPr>
+                    <a:xfrm>
+                      <a:off x="0" y="0"/>
+                      <a:ext cx="3439005" cy="1581371"/>
+                    </a:xfrm>
+                    <a:prstGeom prst="rect">
+                      <a:avLst/>
+                    </a:prstGeom>
+                  </pic:spPr>
+                </pic:pic>
+              </a:graphicData>
+            </a:graphic>
+          </wp:inline>
+        </w:drawing>
+      </w:r>
+    </w:p>
+    <w:p/>
+    <w:p>
+      <w:r>
+        <w:lastRenderedPageBreak/>
+        <w:drawing>
+          <wp:inline distT="0" distB="0" distL="0" distR="0" wp14:anchorId="22F62AEE" wp14:editId="5806CCCC">
+            <wp:extent cx="5943600" cy="3221990"/>
+            <wp:effectExtent l="0" t="0" r="0" b="0"/>
+            <wp:docPr id="629560216" name="Picture 1"/>
+            <wp:cNvGraphicFramePr>
+              <a:graphicFrameLocks xmlns:a="http://schemas.openxmlformats.org/drawingml/2006/main" noChangeAspect="1"/>
+            </wp:cNvGraphicFramePr>
+            <a:graphic xmlns:a="http://schemas.openxmlformats.org/drawingml/2006/main">
+              <a:graphicData uri="http://schemas.openxmlformats.org/drawingml/2006/picture">
+                <pic:pic xmlns:pic="http://schemas.openxmlformats.org/drawingml/2006/picture">
+                  <pic:nvPicPr>
+                    <pic:cNvPr id="629560216" name=""/>
+                    <pic:cNvPicPr/>
+                  </pic:nvPicPr>
+                  <pic:blipFill>
+                    <a:blip r:embed="rId17"/>
+                    <a:stretch>
+                      <a:fillRect/>
+                    </a:stretch>
+                  </pic:blipFill>
+                  <pic:spPr>
+                    <a:xfrm>
+                      <a:off x="0" y="0"/>
+                      <a:ext cx="5943600" cy="3221990"/>
+                    </a:xfrm>
+                    <a:prstGeom prst="rect">
+                      <a:avLst/>
+                    </a:prstGeom>
+                  </pic:spPr>
+                </pic:pic>
+              </a:graphicData>
+            </a:graphic>
+          </wp:inline>
+        </w:drawing>
+      </w:r>
+    </w:p>
+    <w:p/>
+    <w:p>
+      <w:r>
+        <w:t xml:space="preserve"># </w:t>
+      </w:r>
+      <w:r>
+        <w:rPr>
+          <w:b/>
+          <w:bCs/>
+        </w:rPr>
+        <w:t>repository created</w:t>
+      </w:r>
+      <w:r>
+        <w:t>:</w:t>
+      </w:r>
+    </w:p>
+    <w:p/>
+    <w:p>
+      <w:r>
+        <w:drawing>
+          <wp:inline distT="0" distB="0" distL="0" distR="0" wp14:anchorId="18AF3EC5" wp14:editId="4802CD49">
+            <wp:extent cx="5943600" cy="2339975"/>
+            <wp:effectExtent l="0" t="0" r="0" b="3175"/>
+            <wp:docPr id="876291645" name="Picture 1"/>
+            <wp:cNvGraphicFramePr>
+              <a:graphicFrameLocks xmlns:a="http://schemas.openxmlformats.org/drawingml/2006/main" noChangeAspect="1"/>
+            </wp:cNvGraphicFramePr>
+            <a:graphic xmlns:a="http://schemas.openxmlformats.org/drawingml/2006/main">
+              <a:graphicData uri="http://schemas.openxmlformats.org/drawingml/2006/picture">
+                <pic:pic xmlns:pic="http://schemas.openxmlformats.org/drawingml/2006/picture">
+                  <pic:nvPicPr>
+                    <pic:cNvPr id="876291645" name=""/>
+                    <pic:cNvPicPr/>
+                  </pic:nvPicPr>
+                  <pic:blipFill>
+                    <a:blip r:embed="rId18"/>
+                    <a:stretch>
+                      <a:fillRect/>
+                    </a:stretch>
+                  </pic:blipFill>
+                  <pic:spPr>
+                    <a:xfrm>
+                      <a:off x="0" y="0"/>
+                      <a:ext cx="5943600" cy="2339975"/>
+                    </a:xfrm>
+                    <a:prstGeom prst="rect">
+                      <a:avLst/>
+                    </a:prstGeom>
+                  </pic:spPr>
+                </pic:pic>
+              </a:graphicData>
+            </a:graphic>
+          </wp:inline>
+        </w:drawing>
+      </w:r>
+    </w:p>
+    <w:p>
+      <w:r>
+        <w:t xml:space="preserve"># Take </w:t>
+      </w:r>
+      <w:proofErr w:type="spellStart"/>
+      <w:r>
+        <w:t>Github</w:t>
+      </w:r>
+      <w:proofErr w:type="spellEnd"/>
+      <w:r>
+        <w:t xml:space="preserve"> repo URL:</w:t>
+      </w:r>
+    </w:p>
+    <w:p>
+      <w:r>
+        <w:rPr>
+          <w:noProof/>
+        </w:rPr>
+        <w:lastRenderedPageBreak/>
+        <mc:AlternateContent>
+          <mc:Choice Requires="wps">
+            <w:drawing>
+              <wp:anchor distT="0" distB="0" distL="114300" distR="114300" simplePos="0" relativeHeight="251662336" behindDoc="0" locked="0" layoutInCell="1" allowOverlap="1" wp14:anchorId="0396AB51" wp14:editId="50358746">
+                <wp:simplePos x="0" y="0"/>
+                <wp:positionH relativeFrom="column">
+                  <wp:posOffset>2762250</wp:posOffset>
+                </wp:positionH>
+                <wp:positionV relativeFrom="paragraph">
+                  <wp:posOffset>1136650</wp:posOffset>
+                </wp:positionV>
+                <wp:extent cx="2209800" cy="469900"/>
+                <wp:effectExtent l="0" t="0" r="19050" b="25400"/>
+                <wp:wrapNone/>
+                <wp:docPr id="1129791226" name="Rectangle 1"/>
+                <wp:cNvGraphicFramePr/>
+                <a:graphic xmlns:a="http://schemas.openxmlformats.org/drawingml/2006/main">
+                  <a:graphicData uri="http://schemas.microsoft.com/office/word/2010/wordprocessingShape">
+                    <wps:wsp>
+                      <wps:cNvSpPr/>
+                      <wps:spPr>
+                        <a:xfrm>
+                          <a:off x="0" y="0"/>
+                          <a:ext cx="2209800" cy="469900"/>
+                        </a:xfrm>
+                        <a:prstGeom prst="rect">
+                          <a:avLst/>
+                        </a:prstGeom>
+                        <a:noFill/>
+                        <a:ln>
+                          <a:solidFill>
+                            <a:srgbClr val="FF0000"/>
+                          </a:solidFill>
+                        </a:ln>
+                      </wps:spPr>
+                      <wps:style>
+                        <a:lnRef idx="2">
+                          <a:schemeClr val="accent1">
+                            <a:shade val="15000"/>
+                          </a:schemeClr>
+                        </a:lnRef>
+                        <a:fillRef idx="1">
+                          <a:schemeClr val="accent1"/>
+                        </a:fillRef>
+                        <a:effectRef idx="0">
+                          <a:schemeClr val="accent1"/>
+                        </a:effectRef>
+                        <a:fontRef idx="minor">
+                          <a:schemeClr val="lt1"/>
+                        </a:fontRef>
+                      </wps:style>
+                      <wps:bodyPr rot="0" spcFirstLastPara="0" vertOverflow="overflow" horzOverflow="overflow" vert="horz" wrap="square" lIns="91440" tIns="45720" rIns="91440" bIns="45720" numCol="1" spcCol="0" rtlCol="0" fromWordArt="0" anchor="ctr" anchorCtr="0" forceAA="0" compatLnSpc="1">
+                        <a:prstTxWarp prst="textNoShape">
+                          <a:avLst/>
+                        </a:prstTxWarp>
+                        <a:noAutofit/>
+                      </wps:bodyPr>
+                    </wps:wsp>
+                  </a:graphicData>
+                </a:graphic>
+              </wp:anchor>
+            </w:drawing>
+          </mc:Choice>
+          <mc:Fallback>
+            <w:pict>
+              <v:rect w14:anchorId="48009DA6" id="Rectangle 1" o:spid="_x0000_s1026" style="position:absolute;margin-left:217.5pt;margin-top:89.5pt;width:174pt;height:37pt;z-index:251662336;visibility:visible;mso-wrap-style:square;mso-wrap-distance-left:9pt;mso-wrap-distance-top:0;mso-wrap-distance-right:9pt;mso-wrap-distance-bottom:0;mso-position-horizontal:absolute;mso-position-horizontal-relative:text;mso-position-vertical:absolute;mso-position-vertical-relative:text;v-text-anchor:middle" o:gfxdata="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" filled="f" strokecolor="red" strokeweight="1.5pt"/>
+            </w:pict>
+          </mc:Fallback>
+        </mc:AlternateContent>
+      </w:r>
+      <w:r>
+        <w:drawing>
+          <wp:inline distT="0" distB="0" distL="0" distR="0" wp14:anchorId="49AF5031" wp14:editId="0234DC9F">
+            <wp:extent cx="5943600" cy="2807970"/>
+            <wp:effectExtent l="0" t="0" r="0" b="0"/>
+            <wp:docPr id="1762234224" name="Picture 1"/>
+            <wp:cNvGraphicFramePr>
+              <a:graphicFrameLocks xmlns:a="http://schemas.openxmlformats.org/drawingml/2006/main" noChangeAspect="1"/>
+            </wp:cNvGraphicFramePr>
+            <a:graphic xmlns:a="http://schemas.openxmlformats.org/drawingml/2006/main">
+              <a:graphicData uri="http://schemas.openxmlformats.org/drawingml/2006/picture">
+                <pic:pic xmlns:pic="http://schemas.openxmlformats.org/drawingml/2006/picture">
+                  <pic:nvPicPr>
+                    <pic:cNvPr id="1762234224" name=""/>
+                    <pic:cNvPicPr/>
+                  </pic:nvPicPr>
+                  <pic:blipFill>
+                    <a:blip r:embed="rId19"/>
+                    <a:stretch>
+                      <a:fillRect/>
+                    </a:stretch>
+                  </pic:blipFill>
+                  <pic:spPr>
+                    <a:xfrm>
+                      <a:off x="0" y="0"/>
+                      <a:ext cx="5943600" cy="2807970"/>
+                    </a:xfrm>
+                    <a:prstGeom prst="rect">
+                      <a:avLst/>
+                    </a:prstGeom>
+                  </pic:spPr>
+                </pic:pic>
+              </a:graphicData>
+            </a:graphic>
+          </wp:inline>
+        </w:drawing>
+      </w:r>
+    </w:p>
+    <w:p/>
     <w:sectPr>
       <w:pgSz w:w="12240" w:h="15840"/>
       <w:pgMar w:top="1440" w:right="1440" w:bottom="1440" w:left="1440" w:header="720" w:footer="720" w:gutter="0"/>

</xml_diff>